<commit_message>
Add third team member (Anupria Gupta) to report and slides
Co-Authored-By: Claude Sonnet 5.5 <noreply@anthropic.com>
</commit_message>
<xml_diff>
--- a/docs/submission/MPFT_Mini_Project_Report.docx
+++ b/docs/submission/MPFT_Mini_Project_Report.docx
@@ -368,6 +368,80 @@
                 <w:sz w:val="22"/>
               </w:rPr>
               <w:t>1262242629</w:t>
+            </w:r>
+          </w:p>
+        </w:tc>
+      </w:tr>
+      <w:tr>
+        <w:trPr>
+          <w:cantSplit/>
+        </w:trPr>
+        <w:tc>
+          <w:tcPr>
+            <w:tcW w:w="864" w:type="dxa"/>
+            <w:tcBorders>
+              <w:top w:val="single" w:sz="4" w:space="0" w:color="D9D9D9"/>
+              <w:left w:val="single" w:sz="4" w:space="0" w:color="D9D9D9"/>
+              <w:bottom w:val="single" w:sz="4" w:space="0" w:color="D9D9D9"/>
+              <w:right w:val="single" w:sz="4" w:space="0" w:color="D9D9D9"/>
+            </w:tcBorders>
+          </w:tcPr>
+          <w:p>
+            <w:pPr>
+              <w:spacing w:before="80" w:after="80" w:line="264" w:lineRule="auto"/>
+              <w:jc w:val="left"/>
+            </w:pPr>
+            <w:r>
+              <w:rPr>
+                <w:sz w:val="22"/>
+              </w:rPr>
+              <w:t>3</w:t>
+            </w:r>
+          </w:p>
+        </w:tc>
+        <w:tc>
+          <w:tcPr>
+            <w:tcW w:w="5184" w:type="dxa"/>
+            <w:tcBorders>
+              <w:top w:val="single" w:sz="4" w:space="0" w:color="D9D9D9"/>
+              <w:left w:val="single" w:sz="4" w:space="0" w:color="D9D9D9"/>
+              <w:bottom w:val="single" w:sz="4" w:space="0" w:color="D9D9D9"/>
+              <w:right w:val="single" w:sz="4" w:space="0" w:color="D9D9D9"/>
+            </w:tcBorders>
+          </w:tcPr>
+          <w:p>
+            <w:pPr>
+              <w:spacing w:before="80" w:after="80" w:line="264" w:lineRule="auto"/>
+              <w:jc w:val="left"/>
+            </w:pPr>
+            <w:r>
+              <w:rPr>
+                <w:sz w:val="22"/>
+              </w:rPr>
+              <w:t>Anupria Gupta</w:t>
+            </w:r>
+          </w:p>
+        </w:tc>
+        <w:tc>
+          <w:tcPr>
+            <w:tcW w:w="2981" w:type="dxa"/>
+            <w:tcBorders>
+              <w:top w:val="single" w:sz="4" w:space="0" w:color="D9D9D9"/>
+              <w:left w:val="single" w:sz="4" w:space="0" w:color="D9D9D9"/>
+              <w:bottom w:val="single" w:sz="4" w:space="0" w:color="D9D9D9"/>
+              <w:right w:val="single" w:sz="4" w:space="0" w:color="D9D9D9"/>
+            </w:tcBorders>
+          </w:tcPr>
+          <w:p>
+            <w:pPr>
+              <w:spacing w:before="80" w:after="80" w:line="264" w:lineRule="auto"/>
+              <w:jc w:val="left"/>
+            </w:pPr>
+            <w:r>
+              <w:rPr>
+                <w:sz w:val="22"/>
+              </w:rPr>
+              <w:t>1262241349</w:t>
             </w:r>
           </w:p>
         </w:tc>
@@ -738,6 +812,57 @@
           </w:p>
         </w:tc>
       </w:tr>
+      <w:tr>
+        <w:trPr>
+          <w:cantSplit/>
+        </w:trPr>
+        <w:tc>
+          <w:tcPr>
+            <w:tcW w:w="6048" w:type="dxa"/>
+            <w:tcBorders>
+              <w:top w:val="single" w:sz="4" w:space="0" w:color="D9D9D9"/>
+              <w:left w:val="single" w:sz="4" w:space="0" w:color="D9D9D9"/>
+              <w:bottom w:val="single" w:sz="4" w:space="0" w:color="D9D9D9"/>
+              <w:right w:val="single" w:sz="4" w:space="0" w:color="D9D9D9"/>
+            </w:tcBorders>
+          </w:tcPr>
+          <w:p>
+            <w:pPr>
+              <w:spacing w:before="80" w:after="80" w:line="264" w:lineRule="auto"/>
+              <w:jc w:val="left"/>
+            </w:pPr>
+            <w:r>
+              <w:rPr>
+                <w:sz w:val="22"/>
+              </w:rPr>
+              <w:t>Anupria Gupta</w:t>
+            </w:r>
+          </w:p>
+        </w:tc>
+        <w:tc>
+          <w:tcPr>
+            <w:tcW w:w="2981" w:type="dxa"/>
+            <w:tcBorders>
+              <w:top w:val="single" w:sz="4" w:space="0" w:color="D9D9D9"/>
+              <w:left w:val="single" w:sz="4" w:space="0" w:color="D9D9D9"/>
+              <w:bottom w:val="single" w:sz="4" w:space="0" w:color="D9D9D9"/>
+              <w:right w:val="single" w:sz="4" w:space="0" w:color="D9D9D9"/>
+            </w:tcBorders>
+          </w:tcPr>
+          <w:p>
+            <w:pPr>
+              <w:spacing w:before="80" w:after="80" w:line="264" w:lineRule="auto"/>
+              <w:jc w:val="left"/>
+            </w:pPr>
+            <w:r>
+              <w:rPr>
+                <w:sz w:val="22"/>
+              </w:rPr>
+              <w:t>1262241349</w:t>
+            </w:r>
+          </w:p>
+        </w:tc>
+      </w:tr>
     </w:tbl>
     <w:p/>
     <w:p>
@@ -889,7 +1014,7 @@
       <w:r>
         <w:t>1 Introduction and Project Objectives</w:t>
         <w:tab/>
-        <w:t>6</w:t>
+        <w:t>7</w:t>
       </w:r>
     </w:p>
     <w:p>
@@ -899,7 +1024,7 @@
       <w:r>
         <w:t>1.1 Introduction and Background</w:t>
         <w:tab/>
-        <w:t>6</w:t>
+        <w:t>7</w:t>
       </w:r>
     </w:p>
     <w:p>
@@ -909,7 +1034,7 @@
       <w:r>
         <w:t>1.2 Problem Statement</w:t>
         <w:tab/>
-        <w:t>6</w:t>
+        <w:t>7</w:t>
       </w:r>
     </w:p>
     <w:p>
@@ -919,7 +1044,7 @@
       <w:r>
         <w:t>1.3 Scope</w:t>
         <w:tab/>
-        <w:t>6</w:t>
+        <w:t>7</w:t>
       </w:r>
     </w:p>
     <w:p>
@@ -929,7 +1054,7 @@
       <w:r>
         <w:t>1.4 Objectives</w:t>
         <w:tab/>
-        <w:t>7</w:t>
+        <w:t>8</w:t>
       </w:r>
     </w:p>
     <w:p>
@@ -939,7 +1064,7 @@
       <w:r>
         <w:t>2 Proposed Design and Requirements</w:t>
         <w:tab/>
-        <w:t>8</w:t>
+        <w:t>9</w:t>
       </w:r>
     </w:p>
     <w:p>
@@ -949,7 +1074,7 @@
       <w:r>
         <w:t>2.1 Architecture and Network Topology</w:t>
         <w:tab/>
-        <w:t>8</w:t>
+        <w:t>9</w:t>
       </w:r>
     </w:p>
     <w:p>
@@ -959,7 +1084,7 @@
       <w:r>
         <w:t>2.2 Tools and System Requirements</w:t>
         <w:tab/>
-        <w:t>8</w:t>
+        <w:t>9</w:t>
       </w:r>
     </w:p>
     <w:p>
@@ -969,7 +1094,7 @@
       <w:r>
         <w:t>2.3 Addressing and Protocol Selection</w:t>
         <w:tab/>
-        <w:t>9</w:t>
+        <w:t>10</w:t>
       </w:r>
     </w:p>
     <w:p>
@@ -979,7 +1104,7 @@
       <w:r>
         <w:t>3 Implementation and Technical Working</w:t>
         <w:tab/>
-        <w:t>11</w:t>
+        <w:t>12</w:t>
       </w:r>
     </w:p>
     <w:p>
@@ -989,7 +1114,7 @@
       <w:r>
         <w:t>3.1 Methodology</w:t>
         <w:tab/>
-        <w:t>11</w:t>
+        <w:t>12</w:t>
       </w:r>
     </w:p>
     <w:p>
@@ -999,7 +1124,7 @@
       <w:r>
         <w:t>3.2 Configuration or Code Implementation</w:t>
         <w:tab/>
-        <w:t>11</w:t>
+        <w:t>12</w:t>
       </w:r>
     </w:p>
     <w:p>
@@ -1009,7 +1134,7 @@
       <w:r>
         <w:t>3.3 Protocols and Technical Working</w:t>
         <w:tab/>
-        <w:t>12</w:t>
+        <w:t>13</w:t>
       </w:r>
     </w:p>
     <w:p>
@@ -1019,7 +1144,7 @@
       <w:r>
         <w:t>3.4 Execution Procedure</w:t>
         <w:tab/>
-        <w:t>12</w:t>
+        <w:t>13</w:t>
       </w:r>
     </w:p>
     <w:p>
@@ -1029,7 +1154,7 @@
       <w:r>
         <w:t>3.5 Sender and Receiver Views, Scenarios and Graph Axis</w:t>
         <w:tab/>
-        <w:t>15</w:t>
+        <w:t>16</w:t>
       </w:r>
     </w:p>
     <w:p>
@@ -1039,7 +1164,7 @@
       <w:r>
         <w:t>4 Testing and Results</w:t>
         <w:tab/>
-        <w:t>19</w:t>
+        <w:t>20</w:t>
       </w:r>
     </w:p>
     <w:p>
@@ -1049,7 +1174,7 @@
       <w:r>
         <w:t>4.1 Test Plan</w:t>
         <w:tab/>
-        <w:t>19</w:t>
+        <w:t>20</w:t>
       </w:r>
     </w:p>
     <w:p>
@@ -1059,7 +1184,7 @@
       <w:r>
         <w:t>4.2 Results and Execution Evidence</w:t>
         <w:tab/>
-        <w:t>20</w:t>
+        <w:t>21</w:t>
       </w:r>
     </w:p>
     <w:p>
@@ -1069,7 +1194,7 @@
       <w:r>
         <w:t>4.3 Objective Achievement</w:t>
         <w:tab/>
-        <w:t>23</w:t>
+        <w:t>24</w:t>
       </w:r>
     </w:p>
     <w:p>
@@ -1079,7 +1204,7 @@
       <w:r>
         <w:t>5 Discussion and Conclusion</w:t>
         <w:tab/>
-        <w:t>25</w:t>
+        <w:t>26</w:t>
       </w:r>
     </w:p>
     <w:p>
@@ -1089,7 +1214,7 @@
       <w:r>
         <w:t>5.1 Discussion and Comparative Analysis</w:t>
         <w:tab/>
-        <w:t>25</w:t>
+        <w:t>26</w:t>
       </w:r>
     </w:p>
     <w:p>
@@ -1099,7 +1224,7 @@
       <w:r>
         <w:t>5.2 Advantages and Applications</w:t>
         <w:tab/>
-        <w:t>25</w:t>
+        <w:t>26</w:t>
       </w:r>
     </w:p>
     <w:p>
@@ -1109,7 +1234,7 @@
       <w:r>
         <w:t>5.3 Limitations</w:t>
         <w:tab/>
-        <w:t>25</w:t>
+        <w:t>26</w:t>
       </w:r>
     </w:p>
     <w:p>
@@ -1119,7 +1244,7 @@
       <w:r>
         <w:t>5.4 Challenges and Troubleshooting</w:t>
         <w:tab/>
-        <w:t>26</w:t>
+        <w:t>27</w:t>
       </w:r>
     </w:p>
     <w:p>
@@ -1129,7 +1254,7 @@
       <w:r>
         <w:t>5.5 Future Scope</w:t>
         <w:tab/>
-        <w:t>26</w:t>
+        <w:t>27</w:t>
       </w:r>
     </w:p>
     <w:p>
@@ -1139,7 +1264,7 @@
       <w:r>
         <w:t>5.6 Conclusion</w:t>
         <w:tab/>
-        <w:t>27</w:t>
+        <w:t>28</w:t>
       </w:r>
     </w:p>
     <w:p>
@@ -1149,7 +1274,7 @@
       <w:r>
         <w:t>References</w:t>
         <w:tab/>
-        <w:t>28</w:t>
+        <w:t>29</w:t>
       </w:r>
     </w:p>
     <w:p>
@@ -1159,7 +1284,7 @@
       <w:r>
         <w:t>AI Usage Declaration</w:t>
         <w:tab/>
-        <w:t>29</w:t>
+        <w:t>30</w:t>
       </w:r>
     </w:p>
     <w:p>
@@ -1169,7 +1294,7 @@
       <w:r>
         <w:t>Appendices</w:t>
         <w:tab/>
-        <w:t>30</w:t>
+        <w:t>31</w:t>
       </w:r>
     </w:p>
     <w:p>
@@ -1179,7 +1304,7 @@
       <w:r>
         <w:t>Appendix A Code and Configuration</w:t>
         <w:tab/>
-        <w:t>30</w:t>
+        <w:t>31</w:t>
       </w:r>
     </w:p>
     <w:p>
@@ -1189,7 +1314,7 @@
       <w:r>
         <w:t>Appendix B Additional Evidence</w:t>
         <w:tab/>
-        <w:t>31</w:t>
+        <w:t>32</w:t>
       </w:r>
     </w:p>
     <w:p>
@@ -1199,7 +1324,7 @@
       <w:r>
         <w:t>Appendix C Individual Contributions</w:t>
         <w:tab/>
-        <w:t>32</w:t>
+        <w:t>33</w:t>
       </w:r>
     </w:p>
     <w:p>
@@ -1215,7 +1340,155 @@
         <w:pStyle w:val="TOC2"/>
       </w:pPr>
       <w:r>
-        <w:t>Figure 2.1  Proposed architecture: sender, parallel emulated paths, receiver</w:t>
+        <w:t>Figure 2.1 Proposed architecture: sender, parallel emulated paths, receiver</w:t>
+        <w:tab/>
+        <w:t>9</w:t>
+      </w:r>
+    </w:p>
+    <w:p>
+      <w:pPr>
+        <w:pStyle w:val="TOC2"/>
+      </w:pPr>
+      <w:r>
+        <w:t>Figure 3.1 MPFT message sequence with a NACK and retransmission</w:t>
+        <w:tab/>
+        <w:t>12</w:t>
+      </w:r>
+    </w:p>
+    <w:p>
+      <w:pPr>
+        <w:pStyle w:val="TOC2"/>
+      </w:pPr>
+      <w:r>
+        <w:t>Figure 3.2 Dashboard for a 30 MiB transfer with a path killed at 3 s</w:t>
+        <w:tab/>
+        <w:t>15</w:t>
+      </w:r>
+    </w:p>
+    <w:p>
+      <w:pPr>
+        <w:pStyle w:val="TOC2"/>
+      </w:pPr>
+      <w:r>
+        <w:t>Figure 3.3 Per-path table, incidents and file verification</w:t>
+        <w:tab/>
+        <w:t>16</w:t>
+      </w:r>
+    </w:p>
+    <w:p>
+      <w:pPr>
+        <w:pStyle w:val="TOC2"/>
+      </w:pPr>
+      <w:r>
+        <w:t>Figure 3.4 Sender view: Delivered, with the scenario and transfer figures</w:t>
+        <w:tab/>
+        <w:t>16</w:t>
+      </w:r>
+    </w:p>
+    <w:p>
+      <w:pPr>
+        <w:pStyle w:val="TOC2"/>
+      </w:pPr>
+      <w:r>
+        <w:t>Figure 3.5 Receiver view: Saved and verified, with Download</w:t>
+        <w:tab/>
+        <w:t>17</w:t>
+      </w:r>
+    </w:p>
+    <w:p>
+      <w:pPr>
+        <w:pStyle w:val="TOC2"/>
+      </w:pPr>
+      <w:r>
+        <w:t>Figure 3.6 Receiver view of a failed transfer (total failure scenario)</w:t>
+        <w:tab/>
+        <w:t>18</w:t>
+      </w:r>
+    </w:p>
+    <w:p>
+      <w:pPr>
+        <w:pStyle w:val="TOC2"/>
+      </w:pPr>
+      <w:r>
+        <w:t>Figure 3.7 Slow-WAN scenario: per-path graphs on a millisecond axis</w:t>
+        <w:tab/>
+        <w:t>19</w:t>
+      </w:r>
+    </w:p>
+    <w:p>
+      <w:pPr>
+        <w:pStyle w:val="TOC2"/>
+      </w:pPr>
+      <w:r>
+        <w:t>Figure 4.1 Goodput versus number of paths (each 40 Mbit/s, 10 ms)</w:t>
+        <w:tab/>
+        <w:t>22</w:t>
+      </w:r>
+    </w:p>
+    <w:p>
+      <w:pPr>
+        <w:pStyle w:val="TOC2"/>
+      </w:pPr>
+      <w:r>
+        <w:t>Figure 4.2 Transfer time versus extra delay on one of two paths</w:t>
+        <w:tab/>
+        <w:t>22</w:t>
+      </w:r>
+    </w:p>
+    <w:p>
+      <w:pPr>
+        <w:pStyle w:val="TOC2"/>
+      </w:pPr>
+      <w:r>
+        <w:t>Figure 4.3 Bytes carried per path (80 / 20 / 5 Mbit/s)</w:t>
+        <w:tab/>
+        <w:t>23</w:t>
+      </w:r>
+    </w:p>
+    <w:p>
+      <w:pPr>
+        <w:pStyle w:val="TOC2"/>
+      </w:pPr>
+      <w:r>
+        <w:t>Figure 4.4 Recovery timeline after a path failure</w:t>
+        <w:tab/>
+        <w:t>23</w:t>
+      </w:r>
+    </w:p>
+    <w:p>
+      <w:pPr>
+        <w:pStyle w:val="TOC2"/>
+      </w:pPr>
+      <w:r>
+        <w:t>Figure 4.5 Retransmitted chunks versus corruption rate</w:t>
+        <w:tab/>
+        <w:t>24</w:t>
+      </w:r>
+    </w:p>
+    <w:p>
+      <w:pPr>
+        <w:pStyle w:val="TOC2"/>
+      </w:pPr>
+      <w:r>
+        <w:t>Figure 4.6 Goodput versus chunk size</w:t>
+        <w:tab/>
+        <w:t>24</w:t>
+      </w:r>
+    </w:p>
+    <w:p>
+      <w:pPr>
+        <w:pStyle w:val="Heading1"/>
+      </w:pPr>
+      <w:r>
+        <w:t>List of Tables</w:t>
+      </w:r>
+    </w:p>
+    <w:p>
+      <w:pPr>
+        <w:pStyle w:val="TOC2"/>
+      </w:pPr>
+      <w:r>
+        <w:t>Table 1.1 Project objectives and verification</w:t>
         <w:tab/>
         <w:t>8</w:t>
       </w:r>
@@ -1225,7 +1498,27 @@
         <w:pStyle w:val="TOC2"/>
       </w:pPr>
       <w:r>
-        <w:t>Figure 3.1  MPFT message sequence with a NACK and retransmission</w:t>
+        <w:t>Table 2.1 Tools and resources</w:t>
+        <w:tab/>
+        <w:t>10</w:t>
+      </w:r>
+    </w:p>
+    <w:p>
+      <w:pPr>
+        <w:pStyle w:val="TOC2"/>
+      </w:pPr>
+      <w:r>
+        <w:t>Table 2.2 Addresses and ports (topology.example.json defaults)</w:t>
+        <w:tab/>
+        <w:t>10</w:t>
+      </w:r>
+    </w:p>
+    <w:p>
+      <w:pPr>
+        <w:pStyle w:val="TOC2"/>
+      </w:pPr>
+      <w:r>
+        <w:t>Table 2.3 MPFT header (20 bytes, big-endian)</w:t>
         <w:tab/>
         <w:t>11</w:t>
       </w:r>
@@ -1235,9 +1528,9 @@
         <w:pStyle w:val="TOC2"/>
       </w:pPr>
       <w:r>
-        <w:t>Figure 3.2 Dashboard for a 30 MiB transfer with a path killed at 3 s</w:t>
+        <w:t>Table 4.1 Automated tests (pytest)</w:t>
         <w:tab/>
-        <w:t>14</w:t>
+        <w:t>20</w:t>
       </w:r>
     </w:p>
     <w:p>
@@ -1245,57 +1538,7 @@
         <w:pStyle w:val="TOC2"/>
       </w:pPr>
       <w:r>
-        <w:t>Figure 3.3 Per-path table, incidents and file verification</w:t>
-        <w:tab/>
-        <w:t>15</w:t>
-      </w:r>
-    </w:p>
-    <w:p>
-      <w:pPr>
-        <w:pStyle w:val="TOC2"/>
-      </w:pPr>
-      <w:r>
-        <w:t>Figure 3.4 Sender view: Delivered, with the scenario and transfer figures</w:t>
-        <w:tab/>
-        <w:t>15</w:t>
-      </w:r>
-    </w:p>
-    <w:p>
-      <w:pPr>
-        <w:pStyle w:val="TOC2"/>
-      </w:pPr>
-      <w:r>
-        <w:t>Figure 3.5 Receiver view: Saved and verified, with Download</w:t>
-        <w:tab/>
-        <w:t>16</w:t>
-      </w:r>
-    </w:p>
-    <w:p>
-      <w:pPr>
-        <w:pStyle w:val="TOC2"/>
-      </w:pPr>
-      <w:r>
-        <w:t>Figure 3.6 Receiver view of a failed transfer (total failure scenario)</w:t>
-        <w:tab/>
-        <w:t>17</w:t>
-      </w:r>
-    </w:p>
-    <w:p>
-      <w:pPr>
-        <w:pStyle w:val="TOC2"/>
-      </w:pPr>
-      <w:r>
-        <w:t>Figure 3.7 Slow-WAN scenario: per-path graphs on a millisecond axis</w:t>
-        <w:tab/>
-        <w:t>18</w:t>
-      </w:r>
-    </w:p>
-    <w:p>
-      <w:pPr>
-        <w:pStyle w:val="TOC2"/>
-      </w:pPr>
-      <w:r>
-        <w:t>Figure 4.1 Goodput versus number of paths (each 40 Mbit/s, 10 ms)</w:t>
+        <w:t>Table 4.2 Experiments on the emulated network (results/*.csv)</w:t>
         <w:tab/>
         <w:t>21</w:t>
       </w:r>
@@ -1305,127 +1548,9 @@
         <w:pStyle w:val="TOC2"/>
       </w:pPr>
       <w:r>
-        <w:t>Figure 4.2 Transfer time versus extra delay on one of two paths</w:t>
-        <w:tab/>
-        <w:t>21</w:t>
-      </w:r>
-    </w:p>
-    <w:p>
-      <w:pPr>
-        <w:pStyle w:val="TOC2"/>
-      </w:pPr>
-      <w:r>
-        <w:t>Figure 4.3 Bytes carried per path (80 / 20 / 5 Mbit/s)</w:t>
-        <w:tab/>
-        <w:t>22</w:t>
-      </w:r>
-    </w:p>
-    <w:p>
-      <w:pPr>
-        <w:pStyle w:val="TOC2"/>
-      </w:pPr>
-      <w:r>
-        <w:t>Figure 4.4 Recovery timeline after a path failure</w:t>
-        <w:tab/>
-        <w:t>22</w:t>
-      </w:r>
-    </w:p>
-    <w:p>
-      <w:pPr>
-        <w:pStyle w:val="TOC2"/>
-      </w:pPr>
-      <w:r>
-        <w:t>Figure 4.5 Retransmitted chunks versus corruption rate</w:t>
-        <w:tab/>
-        <w:t>23</w:t>
-      </w:r>
-    </w:p>
-    <w:p>
-      <w:pPr>
-        <w:pStyle w:val="TOC2"/>
-      </w:pPr>
-      <w:r>
-        <w:t>Figure 4.6 Goodput versus chunk size</w:t>
-        <w:tab/>
-        <w:t>23</w:t>
-      </w:r>
-    </w:p>
-    <w:p>
-      <w:pPr>
-        <w:pStyle w:val="Heading1"/>
-      </w:pPr>
-      <w:r>
-        <w:t>List of Tables</w:t>
-      </w:r>
-    </w:p>
-    <w:p>
-      <w:pPr>
-        <w:pStyle w:val="TOC2"/>
-      </w:pPr>
-      <w:r>
-        <w:t>Table 1.1  Project objectives and verification</w:t>
-        <w:tab/>
-        <w:t>7</w:t>
-      </w:r>
-    </w:p>
-    <w:p>
-      <w:pPr>
-        <w:pStyle w:val="TOC2"/>
-      </w:pPr>
-      <w:r>
-        <w:t>Table 2.1  Tools and resources</w:t>
-        <w:tab/>
-        <w:t>9</w:t>
-      </w:r>
-    </w:p>
-    <w:p>
-      <w:pPr>
-        <w:pStyle w:val="TOC2"/>
-      </w:pPr>
-      <w:r>
-        <w:t>Table 2.2  Addresses and ports (topology.example.json defaults)</w:t>
-        <w:tab/>
-        <w:t>9</w:t>
-      </w:r>
-    </w:p>
-    <w:p>
-      <w:pPr>
-        <w:pStyle w:val="TOC2"/>
-      </w:pPr>
-      <w:r>
-        <w:t>Table 2.3  MPFT header (20 bytes, big-endian)</w:t>
-        <w:tab/>
-        <w:t>10</w:t>
-      </w:r>
-    </w:p>
-    <w:p>
-      <w:pPr>
-        <w:pStyle w:val="TOC2"/>
-      </w:pPr>
-      <w:r>
-        <w:t>Table 4.1 Automated tests (pytest)</w:t>
-        <w:tab/>
-        <w:t>19</w:t>
-      </w:r>
-    </w:p>
-    <w:p>
-      <w:pPr>
-        <w:pStyle w:val="TOC2"/>
-      </w:pPr>
-      <w:r>
-        <w:t>Table 4.2 Experiments on the emulated network (results/*.csv)</w:t>
-        <w:tab/>
-        <w:t>20</w:t>
-      </w:r>
-    </w:p>
-    <w:p>
-      <w:pPr>
-        <w:pStyle w:val="TOC2"/>
-      </w:pPr>
-      <w:r>
         <w:t>Table 4.3 Objective achievement</w:t>
         <w:tab/>
-        <w:t>24</w:t>
+        <w:t>25</w:t>
       </w:r>
     </w:p>
     <w:p>
@@ -1435,7 +1560,7 @@
       <w:r>
         <w:t>Table 5.1 Problems found and how they were resolved</w:t>
         <w:tab/>
-        <w:t>26</w:t>
+        <w:t>27</w:t>
       </w:r>
     </w:p>
     <w:p>
@@ -1445,7 +1570,7 @@
       <w:r>
         <w:t>Table A.1 Main source files</w:t>
         <w:tab/>
-        <w:t>30</w:t>
+        <w:t>31</w:t>
       </w:r>
     </w:p>
     <w:p>
@@ -1455,7 +1580,7 @@
       <w:r>
         <w:t>Table B.1 Selected raw results</w:t>
         <w:tab/>
-        <w:t>32</w:t>
+        <w:t>33</w:t>
       </w:r>
     </w:p>
     <w:p>
@@ -1465,7 +1590,7 @@
       <w:r>
         <w:t>Table C.1 Individual contributions</w:t>
         <w:tab/>
-        <w:t>32</w:t>
+        <w:t>33</w:t>
       </w:r>
     </w:p>
     <w:p>
@@ -10504,6 +10629,75 @@
           </w:p>
         </w:tc>
       </w:tr>
+      <w:tr>
+        <w:trPr>
+          <w:cantSplit/>
+        </w:trPr>
+        <w:tc>
+          <w:tcPr>
+            <w:tcW w:w="4464" w:type="dxa"/>
+            <w:tcBorders>
+              <w:top w:val="single" w:sz="4" w:space="0" w:color="D9D9D9"/>
+              <w:left w:val="single" w:sz="4" w:space="0" w:color="D9D9D9"/>
+              <w:bottom w:val="single" w:sz="4" w:space="0" w:color="D9D9D9"/>
+              <w:right w:val="single" w:sz="4" w:space="0" w:color="D9D9D9"/>
+            </w:tcBorders>
+          </w:tcPr>
+          <w:p>
+            <w:pPr>
+              <w:spacing w:before="80" w:after="80" w:line="264" w:lineRule="auto"/>
+              <w:jc w:val="left"/>
+            </w:pPr>
+            <w:r>
+              <w:rPr>
+                <w:sz w:val="22"/>
+              </w:rPr>
+              <w:t>Anupria Gupta</w:t>
+            </w:r>
+          </w:p>
+        </w:tc>
+        <w:tc>
+          <w:tcPr>
+            <w:tcW w:w="2448" w:type="dxa"/>
+            <w:tcBorders>
+              <w:top w:val="single" w:sz="4" w:space="0" w:color="D9D9D9"/>
+              <w:left w:val="single" w:sz="4" w:space="0" w:color="D9D9D9"/>
+              <w:bottom w:val="single" w:sz="4" w:space="0" w:color="D9D9D9"/>
+              <w:right w:val="single" w:sz="4" w:space="0" w:color="D9D9D9"/>
+            </w:tcBorders>
+          </w:tcPr>
+          <w:p>
+            <w:pPr>
+              <w:spacing w:before="80" w:after="80" w:line="264" w:lineRule="auto"/>
+              <w:jc w:val="left"/>
+            </w:pPr>
+            <w:r>
+              <w:rPr>
+                <w:sz w:val="22"/>
+              </w:rPr>
+              <w:t>1262241349</w:t>
+            </w:r>
+          </w:p>
+        </w:tc>
+        <w:tc>
+          <w:tcPr>
+            <w:tcW w:w="2117" w:type="dxa"/>
+            <w:tcBorders>
+              <w:top w:val="single" w:sz="4" w:space="0" w:color="D9D9D9"/>
+              <w:left w:val="single" w:sz="4" w:space="0" w:color="D9D9D9"/>
+              <w:bottom w:val="single" w:sz="4" w:space="0" w:color="D9D9D9"/>
+              <w:right w:val="single" w:sz="4" w:space="0" w:color="D9D9D9"/>
+            </w:tcBorders>
+          </w:tcPr>
+          <w:p>
+            <w:pPr>
+              <w:spacing w:before="80" w:after="80" w:line="264" w:lineRule="auto"/>
+              <w:jc w:val="left"/>
+            </w:pPr>
+            <w:r/>
+          </w:p>
+        </w:tc>
+      </w:tr>
     </w:tbl>
     <w:p/>
     <w:p>
@@ -14301,7 +14495,7 @@
               <w:rPr>
                 <w:sz w:val="20"/>
               </w:rPr>
-              <w:t xml:space="preserve">Network emulator and experiments; Wireshark dissector and capture steps; test report; presentation</w:t>
+              <w:t>Network emulator and experiments; presentation</w:t>
             </w:r>
           </w:p>
         </w:tc>
@@ -14324,7 +14518,81 @@
               <w:rPr>
                 <w:sz w:val="20"/>
               </w:rPr>
-              <w:t xml:space="preserve">mpft/emulator.py, experiments/, results/, wireshark/, docs/TEST_REPORT.md</w:t>
+              <w:t>mpft/emulator.py, experiments/, results/</w:t>
+            </w:r>
+          </w:p>
+        </w:tc>
+      </w:tr>
+      <w:tr>
+        <w:trPr>
+          <w:cantSplit/>
+        </w:trPr>
+        <w:tc>
+          <w:tcPr>
+            <w:tcW w:w="2400" w:type="dxa"/>
+            <w:tcBorders>
+              <w:top w:val="single" w:sz="4" w:space="0" w:color="D9D9D9"/>
+              <w:left w:val="single" w:sz="4" w:space="0" w:color="D9D9D9"/>
+              <w:bottom w:val="single" w:sz="4" w:space="0" w:color="D9D9D9"/>
+              <w:right w:val="single" w:sz="4" w:space="0" w:color="D9D9D9"/>
+            </w:tcBorders>
+          </w:tcPr>
+          <w:p>
+            <w:pPr>
+              <w:spacing w:before="60" w:after="60" w:line="252" w:lineRule="auto"/>
+              <w:jc w:val="left"/>
+            </w:pPr>
+            <w:r>
+              <w:rPr>
+                <w:sz w:val="20"/>
+              </w:rPr>
+              <w:t>Anupria Gupta, PRN 1262241349</w:t>
+            </w:r>
+          </w:p>
+        </w:tc>
+        <w:tc>
+          <w:tcPr>
+            <w:tcW w:w="3600" w:type="dxa"/>
+            <w:tcBorders>
+              <w:top w:val="single" w:sz="4" w:space="0" w:color="D9D9D9"/>
+              <w:left w:val="single" w:sz="4" w:space="0" w:color="D9D9D9"/>
+              <w:bottom w:val="single" w:sz="4" w:space="0" w:color="D9D9D9"/>
+              <w:right w:val="single" w:sz="4" w:space="0" w:color="D9D9D9"/>
+            </w:tcBorders>
+          </w:tcPr>
+          <w:p>
+            <w:pPr>
+              <w:spacing w:before="60" w:after="60" w:line="252" w:lineRule="auto"/>
+              <w:jc w:val="left"/>
+            </w:pPr>
+            <w:r>
+              <w:rPr>
+                <w:sz w:val="20"/>
+              </w:rPr>
+              <w:t>Wireshark dissector and capture steps; web interface views and screenshots; test report</w:t>
+            </w:r>
+          </w:p>
+        </w:tc>
+        <w:tc>
+          <w:tcPr>
+            <w:tcW w:w="3029" w:type="dxa"/>
+            <w:tcBorders>
+              <w:top w:val="single" w:sz="4" w:space="0" w:color="D9D9D9"/>
+              <w:left w:val="single" w:sz="4" w:space="0" w:color="D9D9D9"/>
+              <w:bottom w:val="single" w:sz="4" w:space="0" w:color="D9D9D9"/>
+              <w:right w:val="single" w:sz="4" w:space="0" w:color="D9D9D9"/>
+            </w:tcBorders>
+          </w:tcPr>
+          <w:p>
+            <w:pPr>
+              <w:spacing w:before="60" w:after="60" w:line="252" w:lineRule="auto"/>
+              <w:jc w:val="left"/>
+            </w:pPr>
+            <w:r>
+              <w:rPr>
+                <w:sz w:val="20"/>
+              </w:rPr>
+              <w:t>wireshark/, docs/screenshots/, docs/TEST_REPORT.md</w:t>
             </w:r>
           </w:p>
         </w:tc>

</xml_diff>